<commit_message>
chore: snapshot legacy budgeting workspace
</commit_message>
<xml_diff>
--- a/base/pacotes/placon-arminio-tavares/justificativa-placon-arminio-tavares.docx
+++ b/base/pacotes/placon-arminio-tavares/justificativa-placon-arminio-tavares.docx
@@ -33,7 +33,7 @@
           <w:color w:val="666666"/>
           <w:sz w:val="22"/>
         </w:rPr>
-        <w:t>Orçamento Paramétrico V2 Híbrido  •  Gerado em 22/04/2026</w:t>
+        <w:t>Orçamento Paramétrico V2 Híbrido  •  Gerado em 23/04/2026</w:t>
       </w:r>
     </w:p>
     <w:p/>
@@ -116,7 +116,7 @@
           <w:i w:val="0"/>
           <w:sz w:val="22"/>
         </w:rPr>
-        <w:t>• Grand Total V2: R$ 18.424.865  •  R$/m²: R$ 4.518,90</w:t>
+        <w:t>• Grand Total V2: R$ 17.347.024  •  R$/m²: R$ 4.254,55</w:t>
       </w:r>
     </w:p>
     <w:p/>
@@ -230,58 +230,6 @@
           </w:tcPr>
           <w:p>
             <w:r>
-              <w:t>Gerenciamento</w:t>
-            </w:r>
-          </w:p>
-        </w:tc>
-        <w:tc>
-          <w:tcPr>
-            <w:tcW w:type="dxa" w:w="1994"/>
-          </w:tcPr>
-          <w:p>
-            <w:r>
-              <w:t>R$ 4.044.504</w:t>
-            </w:r>
-          </w:p>
-        </w:tc>
-        <w:tc>
-          <w:tcPr>
-            <w:tcW w:type="dxa" w:w="1994"/>
-          </w:tcPr>
-          <w:p>
-            <w:r>
-              <w:t>R$ 991,96</w:t>
-            </w:r>
-          </w:p>
-        </w:tc>
-        <w:tc>
-          <w:tcPr>
-            <w:tcW w:type="dxa" w:w="1994"/>
-          </w:tcPr>
-          <w:p>
-            <w:r>
-              <w:t>22.0%</w:t>
-            </w:r>
-          </w:p>
-        </w:tc>
-        <w:tc>
-          <w:tcPr>
-            <w:tcW w:type="dxa" w:w="1994"/>
-          </w:tcPr>
-          <w:p>
-            <w:r>
-              <w:t>Alto — combinação AC pequena (4k m²) + prazo 24m infla fixos</w:t>
-            </w:r>
-          </w:p>
-        </w:tc>
-      </w:tr>
-      <w:tr>
-        <w:tc>
-          <w:tcPr>
-            <w:tcW w:type="dxa" w:w="1994"/>
-          </w:tcPr>
-          <w:p>
-            <w:r>
               <w:t>Supraestrutura</w:t>
             </w:r>
           </w:p>
@@ -312,7 +260,7 @@
           </w:tcPr>
           <w:p>
             <w:r>
-              <w:t>17.7%</w:t>
+              <w:t>18.8%</w:t>
             </w:r>
           </w:p>
         </w:tc>
@@ -323,6 +271,58 @@
           <w:p>
             <w:r>
               <w:t>Compatível com laje protendida (+15-25% vs convencional)</w:t>
+            </w:r>
+          </w:p>
+        </w:tc>
+      </w:tr>
+      <w:tr>
+        <w:tc>
+          <w:tcPr>
+            <w:tcW w:type="dxa" w:w="1994"/>
+          </w:tcPr>
+          <w:p>
+            <w:r>
+              <w:t>Gerenciamento</w:t>
+            </w:r>
+          </w:p>
+        </w:tc>
+        <w:tc>
+          <w:tcPr>
+            <w:tcW w:type="dxa" w:w="1994"/>
+          </w:tcPr>
+          <w:p>
+            <w:r>
+              <w:t>R$ 2.972.792</w:t>
+            </w:r>
+          </w:p>
+        </w:tc>
+        <w:tc>
+          <w:tcPr>
+            <w:tcW w:type="dxa" w:w="1994"/>
+          </w:tcPr>
+          <w:p>
+            <w:r>
+              <w:t>R$ 729,11</w:t>
+            </w:r>
+          </w:p>
+        </w:tc>
+        <w:tc>
+          <w:tcPr>
+            <w:tcW w:type="dxa" w:w="1994"/>
+          </w:tcPr>
+          <w:p>
+            <w:r>
+              <w:t>17.1%</w:t>
+            </w:r>
+          </w:p>
+        </w:tc>
+        <w:tc>
+          <w:tcPr>
+            <w:tcW w:type="dxa" w:w="1994"/>
+          </w:tcPr>
+          <w:p>
+            <w:r>
+              <w:t>Alto — combinação AC pequena (4k m²) + prazo 24m infla fixos</w:t>
             </w:r>
           </w:p>
         </w:tc>
@@ -364,7 +364,7 @@
           </w:tcPr>
           <w:p>
             <w:r>
-              <w:t>7.8%</w:t>
+              <w:t>8.3%</w:t>
             </w:r>
           </w:p>
         </w:tc>
@@ -414,7 +414,7 @@
           </w:tcPr>
           <w:p>
             <w:r>
-              <w:t>7.3%</w:t>
+              <w:t>7.8%</w:t>
             </w:r>
           </w:p>
         </w:tc>
@@ -466,7 +466,7 @@
           </w:tcPr>
           <w:p>
             <w:r>
-              <w:t>7.2%</w:t>
+              <w:t>7.6%</w:t>
             </w:r>
           </w:p>
         </w:tc>
@@ -518,7 +518,7 @@
           </w:tcPr>
           <w:p>
             <w:r>
-              <w:t>5.2%</w:t>
+              <w:t>5.6%</w:t>
             </w:r>
           </w:p>
         </w:tc>
@@ -568,7 +568,7 @@
           </w:tcPr>
           <w:p>
             <w:r>
-              <w:t>5.0%</w:t>
+              <w:t>5.3%</w:t>
             </w:r>
           </w:p>
         </w:tc>
@@ -618,7 +618,7 @@
           </w:tcPr>
           <w:p>
             <w:r>
-              <w:t>4.7%</w:t>
+              <w:t>5.0%</w:t>
             </w:r>
           </w:p>
         </w:tc>
@@ -668,7 +668,7 @@
           </w:tcPr>
           <w:p>
             <w:r>
-              <w:t>4.2%</w:t>
+              <w:t>4.5%</w:t>
             </w:r>
           </w:p>
         </w:tc>
@@ -718,7 +718,7 @@
           </w:tcPr>
           <w:p>
             <w:r>
-              <w:t>4.0%</w:t>
+              <w:t>4.3%</w:t>
             </w:r>
           </w:p>
         </w:tc>
@@ -768,7 +768,7 @@
           </w:tcPr>
           <w:p>
             <w:r>
-              <w:t>3.4%</w:t>
+              <w:t>3.6%</w:t>
             </w:r>
           </w:p>
         </w:tc>

</xml_diff>